<commit_message>
fix(docx): update template row sizing according to user edit
</commit_message>
<xml_diff>
--- a/output_test.docx
+++ b/output_test.docx
@@ -2755,7 +2755,7 @@
                 <w:b/>
                 <w:sz w:val="24"/>
               </w:rPr>
-              <w:t>직군1</w:t>
+              <w:t>소속</w:t>
             </w:r>
           </w:p>
         </w:tc>
@@ -2895,7 +2895,7 @@
                 <w:b/>
                 <w:sz w:val="24"/>
               </w:rPr>
-              <w:t>직군2</w:t>
+              <w:t>소속</w:t>
             </w:r>
           </w:p>
         </w:tc>
@@ -3001,18 +3001,19 @@
               <w:rPr>
                 <w:rFonts w:asciiTheme="minorEastAsia" w:eastAsiaTheme="minorEastAsia" w:hAnsiTheme="minorEastAsia"/>
                 <w:b/>
-                <w:sz w:val="24"/>
-                <w:szCs w:val="24"/>
+                <w:sz w:val="18"/>
+                <w:szCs w:val="18"/>
               </w:rPr>
             </w:pPr>
             <w:r>
               <w:rPr>
-                <w:rFonts w:asciiTheme="minorEastAsia" w:eastAsiaTheme="minorEastAsia" w:hAnsiTheme="minorEastAsia" w:hint="eastAsia"/>
-                <w:b/>
-                <w:sz w:val="24"/>
-                <w:szCs w:val="24"/>
-              </w:rPr>
-              <w:t xml:space="preserve">1</w:t>
+                <w:rFonts w:asciiTheme="minorEastAsia" w:eastAsiaTheme="minorEastAsia" w:hAnsiTheme="minorEastAsia"/>
+                <w:b/>
+                <w:bCs/>
+                <w:sz w:val="18"/>
+                <w:szCs w:val="18"/>
+              </w:rPr>
+              <w:t/>
             </w:r>
           </w:p>
         </w:tc>
@@ -3047,7 +3048,7 @@
                 <w:sz w:val="18"/>
                 <w:szCs w:val="18"/>
               </w:rPr>
-              <w:t/>
+              <w:t xml:space="preserve">미화</w:t>
             </w:r>
             <w:r>
               <w:rPr>
@@ -3102,7 +3103,7 @@
                 <w:sz w:val="18"/>
                 <w:szCs w:val="18"/>
               </w:rPr>
-              <w:t/>
+              <w:t xml:space="preserve">홍길동</w:t>
             </w:r>
             <w:r>
               <w:rPr>
@@ -3310,18 +3311,19 @@
               <w:rPr>
                 <w:rFonts w:asciiTheme="minorEastAsia" w:eastAsiaTheme="minorEastAsia" w:hAnsiTheme="minorEastAsia"/>
                 <w:b/>
-                <w:sz w:val="24"/>
-                <w:szCs w:val="24"/>
+                <w:sz w:val="18"/>
+                <w:szCs w:val="18"/>
               </w:rPr>
             </w:pPr>
             <w:r>
               <w:rPr>
-                <w:rFonts w:asciiTheme="minorEastAsia" w:eastAsiaTheme="minorEastAsia" w:hAnsiTheme="minorEastAsia" w:hint="eastAsia"/>
-                <w:b/>
-                <w:sz w:val="24"/>
-                <w:szCs w:val="24"/>
-              </w:rPr>
-              <w:t xml:space="preserve">1</w:t>
+                <w:rFonts w:asciiTheme="minorEastAsia" w:eastAsiaTheme="minorEastAsia" w:hAnsiTheme="minorEastAsia"/>
+                <w:b/>
+                <w:bCs/>
+                <w:sz w:val="18"/>
+                <w:szCs w:val="18"/>
+              </w:rPr>
+              <w:t/>
             </w:r>
           </w:p>
         </w:tc>
@@ -3356,7 +3358,7 @@
                 <w:sz w:val="18"/>
                 <w:szCs w:val="18"/>
               </w:rPr>
-              <w:t/>
+              <w:t xml:space="preserve">보안</w:t>
             </w:r>
             <w:r>
               <w:rPr>
@@ -3411,7 +3413,7 @@
                 <w:sz w:val="18"/>
                 <w:szCs w:val="18"/>
               </w:rPr>
-              <w:t/>
+              <w:t xml:space="preserve">아무개</w:t>
             </w:r>
             <w:r>
               <w:rPr>
@@ -9878,7 +9880,6 @@
   <w:style w:type="character" w:default="1" w:styleId="a0">
     <w:name w:val="Default Paragraph Font"/>
     <w:uiPriority w:val="1"/>
-    <w:semiHidden/>
     <w:unhideWhenUsed/>
   </w:style>
   <w:style w:type="table" w:default="1" w:styleId="a1">

</xml_diff>